<commit_message>
Rewrite the script as information rather than performance
The previous rewrite read as a sales pitch for a product that exists. This
is a Future Anything concept, so the script now states things instead of
selling them.

Cut the "hi we're the NutriBrick team" opener and the scene-setting around
it. It opens on what the product is and what problem it addresses. Also cut
the conversational asides that were padding rather than content.

Kept the structure and order that worked before, and the explanation of the
"don't play with your food" objection, but stated plainly rather than built
towards a line.

689 spoken words: 4:36 at 150 wpm, 4:55 at 140. No em dashes. The Word file
stays plain, one font and one colour.

Co-Authored-By: Claude Opus 5 <noreply@anthropic.com>
Claude-Session: https://claude.ai/code/session_01FsP9zUCC7wrRm8MWR8aTNS
</commit_message>
<xml_diff>
--- a/docs/NutriBrick-pitch-script.docx
+++ b/docs/NutriBrick-pitch-script.docx
@@ -27,7 +27,7 @@
           <w:sz w:val="20"/>
           <w:szCs w:val="20"/>
         </w:rPr>
-        <w:t xml:space="preserve">703 words. Around 4 minutes 30 to 5 minutes. Lines in square brackets are stage directions, not words to say.</w:t>
+        <w:t xml:space="preserve">689 words. Around 4 minutes 30 to 5 minutes depending on pace. Lines in square brackets are stage directions, not words to say.</w:t>
       </w:r>
     </w:p>
     <w:p>
@@ -48,33 +48,46 @@
           <w:sz w:val="22"/>
           <w:szCs w:val="22"/>
         </w:rPr>
-        <w:t xml:space="preserve">[Hero slide, the brick turning]</w:t>
-      </w:r>
-    </w:p>
-    <w:p>
-      <w:pPr>
-        <w:spacing w:after="180" w:line="300"/>
-      </w:pPr>
-      <w:r>
-        <w:rPr>
-          <w:rFonts w:ascii="Calibri" w:cs="Calibri" w:eastAsia="Calibri" w:hAnsi="Calibri"/>
-          <w:sz w:val="24"/>
-          <w:szCs w:val="24"/>
-        </w:rPr>
-        <w:t xml:space="preserve">Hi, we're the NutriBrick team, and this is what we've been working on.</w:t>
-      </w:r>
-    </w:p>
-    <w:p>
-      <w:pPr>
-        <w:spacing w:after="180" w:line="300"/>
-      </w:pPr>
-      <w:r>
-        <w:rPr>
-          <w:rFonts w:ascii="Calibri" w:cs="Calibri" w:eastAsia="Calibri" w:hAnsi="Calibri"/>
-          <w:sz w:val="24"/>
-          <w:szCs w:val="24"/>
-        </w:rPr>
-        <w:t xml:space="preserve">The problem we started with is that over a million children in Australia are unhealthy, and 95% of kids aren't meeting their daily macronutrient targets. Those are big numbers, but the actual problem is smaller and more annoying than that. It happens at about four in the afternoon in most houses. A parent puts something healthy in front of a kid, and the kid doesn't eat it.</w:t>
+        <w:t xml:space="preserve">[Hero slide]</w:t>
+      </w:r>
+    </w:p>
+    <w:p>
+      <w:pPr>
+        <w:spacing w:after="180" w:line="300"/>
+      </w:pPr>
+      <w:r>
+        <w:rPr>
+          <w:rFonts w:ascii="Calibri" w:cs="Calibri" w:eastAsia="Calibri" w:hAnsi="Calibri"/>
+          <w:sz w:val="24"/>
+          <w:szCs w:val="24"/>
+        </w:rPr>
+        <w:t xml:space="preserve">Our product is called NutriBrick. It is a snack for primary school aged children, shaped like a building brick.</w:t>
+      </w:r>
+    </w:p>
+    <w:p>
+      <w:pPr>
+        <w:spacing w:after="180" w:line="300"/>
+      </w:pPr>
+      <w:r>
+        <w:rPr>
+          <w:rFonts w:ascii="Calibri" w:cs="Calibri" w:eastAsia="Calibri" w:hAnsi="Calibri"/>
+          <w:sz w:val="24"/>
+          <w:szCs w:val="24"/>
+        </w:rPr>
+        <w:t xml:space="preserve">The problem we set out to solve is that a lot of Australian children are not eating well. Our research found that over a million children in Australia are unhealthy, and that 95% are not meeting their daily macronutrient targets.</w:t>
+      </w:r>
+    </w:p>
+    <w:p>
+      <w:pPr>
+        <w:spacing w:after="180" w:line="300"/>
+      </w:pPr>
+      <w:r>
+        <w:rPr>
+          <w:rFonts w:ascii="Calibri" w:cs="Calibri" w:eastAsia="Calibri" w:hAnsi="Calibri"/>
+          <w:sz w:val="24"/>
+          <w:szCs w:val="24"/>
+        </w:rPr>
+        <w:t xml:space="preserve">The part that matters is why. It is not that parents do not know what is healthy, because most of them do. The problem is getting children to actually eat it. The healthy snack gets left, something sweet gets swapped in instead, and the same thing happens the next day.</w:t>
       </w:r>
     </w:p>
     <w:p>
@@ -108,7 +121,7 @@
           <w:sz w:val="24"/>
           <w:szCs w:val="24"/>
         </w:rPr>
-        <w:t xml:space="preserve">Parents already know what's healthy. That isn't the gap. The gap is getting kids to actually eat it. Instead the snack goes in the bin untouched, something sweet gets negotiated in, and the same thing happens again tomorrow. Nagging isn't a nutrition plan, and most parents have worked that out already.</w:t>
+        <w:t xml:space="preserve">Younger children mostly decide what they will eat based on how it looks and how it feels in their hands, rather than on what is in it. So a snack that is good for them but looks boring tends to lose, no matter how much a parent explains it.</w:t>
       </w:r>
     </w:p>
     <w:p>
@@ -129,20 +142,20 @@
           <w:sz w:val="22"/>
           <w:szCs w:val="22"/>
         </w:rPr>
-        <w:t xml:space="preserve">[Build it. Stack it. Eat it. Let the tower finish loading before you talk.]</w:t>
-      </w:r>
-    </w:p>
-    <w:p>
-      <w:pPr>
-        <w:spacing w:after="180" w:line="300"/>
-      </w:pPr>
-      <w:r>
-        <w:rPr>
-          <w:rFonts w:ascii="Calibri" w:cs="Calibri" w:eastAsia="Calibri" w:hAnsi="Calibri"/>
-          <w:sz w:val="24"/>
-          <w:szCs w:val="24"/>
-        </w:rPr>
-        <w:t xml:space="preserve">So this is NutriBrick. It's a food bite about the size of a building brick, and the studs on top actually work, so kids can stack them. You build a tower, and then you eat the tower.</w:t>
+        <w:t xml:space="preserve">[Build it. Stack it. Eat it.]</w:t>
+      </w:r>
+    </w:p>
+    <w:p>
+      <w:pPr>
+        <w:spacing w:after="180" w:line="300"/>
+      </w:pPr>
+      <w:r>
+        <w:rPr>
+          <w:rFonts w:ascii="Calibri" w:cs="Calibri" w:eastAsia="Calibri" w:hAnsi="Calibri"/>
+          <w:sz w:val="24"/>
+          <w:szCs w:val="24"/>
+        </w:rPr>
+        <w:t xml:space="preserve">NutriBrick is designed around that. It is a food bite about the size of a Duplo brick, with studs on top that interlock properly, so the bricks stack together. Children build something out of them, and then eat it.</w:t>
       </w:r>
     </w:p>
     <w:p>
@@ -176,33 +189,20 @@
           <w:sz w:val="24"/>
           <w:szCs w:val="24"/>
         </w:rPr>
-        <w:t xml:space="preserve">Now, most parents have said "don't play with your food" at some point. We thought about that one a lot, because at first it sounds like it goes against our whole idea.</w:t>
-      </w:r>
-    </w:p>
-    <w:p>
-      <w:pPr>
-        <w:spacing w:after="180" w:line="300"/>
-      </w:pPr>
-      <w:r>
-        <w:rPr>
-          <w:rFonts w:ascii="Calibri" w:cs="Calibri" w:eastAsia="Calibri" w:hAnsi="Calibri"/>
-          <w:sz w:val="24"/>
-          <w:szCs w:val="24"/>
-        </w:rPr>
-        <w:t xml:space="preserve">But the reason that rule exists is that playing with food normally means wasting it. It gets mashed, or hidden under something, or dropped on the floor. Nothing actually gets eaten.</w:t>
-      </w:r>
-    </w:p>
-    <w:p>
-      <w:pPr>
-        <w:spacing w:after="180" w:line="300"/>
-      </w:pPr>
-      <w:r>
-        <w:rPr>
-          <w:rFonts w:ascii="Calibri" w:cs="Calibri" w:eastAsia="Calibri" w:hAnsi="Calibri"/>
-          <w:sz w:val="24"/>
-          <w:szCs w:val="24"/>
-        </w:rPr>
-        <w:t xml:space="preserve">With NutriBrick, the playing is the part that gets it eaten. The kid builds something, and then it's gone. So the rule still makes sense, it just doesn't apply to this.</w:t>
+        <w:t xml:space="preserve">One thing we had to think about is that a lot of parents do not want their kids playing with food. That rule exists for a reason. Playing with food normally means it gets mashed, hidden or dropped, and none of it actually gets eaten.</w:t>
+      </w:r>
+    </w:p>
+    <w:p>
+      <w:pPr>
+        <w:spacing w:after="180" w:line="300"/>
+      </w:pPr>
+      <w:r>
+        <w:rPr>
+          <w:rFonts w:ascii="Calibri" w:cs="Calibri" w:eastAsia="Calibri" w:hAnsi="Calibri"/>
+          <w:sz w:val="24"/>
+          <w:szCs w:val="24"/>
+        </w:rPr>
+        <w:t xml:space="preserve">With our product, the building is what leads to it being eaten. The food is not wasted, so the reason behind the rule does not really apply here.</w:t>
       </w:r>
     </w:p>
     <w:p>
@@ -236,20 +236,7 @@
           <w:sz w:val="24"/>
           <w:szCs w:val="24"/>
         </w:rPr>
-        <w:t xml:space="preserve">We looked at what's already in the shops. Frozen kid meals need a freezer, a microwave and about twelve minutes. Meal pouches are alright nutritionally, but there's nothing for a kid to do with them. There are already novelty lollies shaped like blocks, but the shape is the whole product. Inside it's sugar.</w:t>
-      </w:r>
-    </w:p>
-    <w:p>
-      <w:pPr>
-        <w:spacing w:after="180" w:line="300"/>
-      </w:pPr>
-      <w:r>
-        <w:rPr>
-          <w:rFonts w:ascii="Calibri" w:cs="Calibri" w:eastAsia="Calibri" w:hAnsi="Calibri"/>
-          <w:sz w:val="24"/>
-          <w:szCs w:val="24"/>
-        </w:rPr>
-        <w:t xml:space="preserve">We couldn't find anything that was a toy and actually good for you at the same time.</w:t>
+        <w:t xml:space="preserve">We compared it against what is already available. Frozen kids meals need a freezer, a microwave and about twelve minutes. Meal pouches are reasonable nutritionally, but there is nothing for a child to do with them. There are already lolly blocks shaped like bricks, but the shape is the whole product and the inside is sugar. We could not find an existing product that was both something to play with and genuinely nutritious.</w:t>
       </w:r>
     </w:p>
     <w:p>
@@ -283,46 +270,46 @@
           <w:sz w:val="24"/>
           <w:szCs w:val="24"/>
         </w:rPr>
-        <w:t xml:space="preserve">So here's what's in one brick. It's 45 grams. That's 203 calories, 13 grams of protein, 4 grams of fibre, and a full day of vitamin C, A and D.</w:t>
-      </w:r>
-    </w:p>
-    <w:p>
-      <w:pPr>
-        <w:spacing w:after="180" w:line="300"/>
-      </w:pPr>
-      <w:r>
-        <w:rPr>
-          <w:rFonts w:ascii="Calibri" w:cs="Calibri" w:eastAsia="Calibri" w:hAnsi="Calibri"/>
-          <w:sz w:val="24"/>
-          <w:szCs w:val="24"/>
-        </w:rPr>
-        <w:t xml:space="preserve">There are seven ingredients. Rolled oats, sunflower seed butter, milk protein, dates, chia and flaxseed, and cocoa and cinnamon for flavour. The only things we add in are those three vitamins, because you can't fit a whole day of them into something this small from food alone.</w:t>
-      </w:r>
-    </w:p>
-    <w:p>
-      <w:pPr>
-        <w:spacing w:after="180" w:line="300"/>
-      </w:pPr>
-      <w:r>
-        <w:rPr>
-          <w:rFonts w:ascii="Calibri" w:cs="Calibri" w:eastAsia="Calibri" w:hAnsi="Calibri"/>
-          <w:sz w:val="24"/>
-          <w:szCs w:val="24"/>
-        </w:rPr>
-        <w:t xml:space="preserve">It's nut free, because the bind comes from sunflower seed butter instead of peanut butter, so it can go to school. There's no gelatine, no refined sugar and no artificial colours.</w:t>
-      </w:r>
-    </w:p>
-    <w:p>
-      <w:pPr>
-        <w:spacing w:after="180" w:line="300"/>
-      </w:pPr>
-      <w:r>
-        <w:rPr>
-          <w:rFonts w:ascii="Calibri" w:cs="Calibri" w:eastAsia="Calibri" w:hAnsi="Calibri"/>
-          <w:sz w:val="24"/>
-          <w:szCs w:val="24"/>
-        </w:rPr>
-        <w:t xml:space="preserve">We should be upfront that those numbers are our targets for the recipe. We haven't had it lab tested yet, because it's still a concept.</w:t>
+        <w:t xml:space="preserve">One brick is 45 grams. It contains 203 calories, 13 grams of protein, 4 grams of fibre, and a full day of vitamin C, A and D for a young child.</w:t>
+      </w:r>
+    </w:p>
+    <w:p>
+      <w:pPr>
+        <w:spacing w:after="180" w:line="300"/>
+      </w:pPr>
+      <w:r>
+        <w:rPr>
+          <w:rFonts w:ascii="Calibri" w:cs="Calibri" w:eastAsia="Calibri" w:hAnsi="Calibri"/>
+          <w:sz w:val="24"/>
+          <w:szCs w:val="24"/>
+        </w:rPr>
+        <w:t xml:space="preserve">There are seven ingredients. Rolled oats, sunflower seed butter, milk protein, dates, chia and flaxseed, and cocoa and cinnamon for flavour. The only added part is the three vitamins, because a bite this size cannot fit a full day of them from food alone.</w:t>
+      </w:r>
+    </w:p>
+    <w:p>
+      <w:pPr>
+        <w:spacing w:after="180" w:line="300"/>
+      </w:pPr>
+      <w:r>
+        <w:rPr>
+          <w:rFonts w:ascii="Calibri" w:cs="Calibri" w:eastAsia="Calibri" w:hAnsi="Calibri"/>
+          <w:sz w:val="24"/>
+          <w:szCs w:val="24"/>
+        </w:rPr>
+        <w:t xml:space="preserve">It is nut free, because the bind comes from sunflower seed butter rather than peanut butter, which means it can go to school. There is no gelatine, no refined sugar and no artificial colours.</w:t>
+      </w:r>
+    </w:p>
+    <w:p>
+      <w:pPr>
+        <w:spacing w:after="180" w:line="300"/>
+      </w:pPr>
+      <w:r>
+        <w:rPr>
+          <w:rFonts w:ascii="Calibri" w:cs="Calibri" w:eastAsia="Calibri" w:hAnsi="Calibri"/>
+          <w:sz w:val="24"/>
+          <w:szCs w:val="24"/>
+        </w:rPr>
+        <w:t xml:space="preserve">These figures are our targets for the recipe. It has not been lab tested, because it is still a concept.</w:t>
       </w:r>
     </w:p>
     <w:p>
@@ -356,7 +343,7 @@
           <w:sz w:val="24"/>
           <w:szCs w:val="24"/>
         </w:rPr>
-        <w:t xml:space="preserve">The reason we care about density is that young kids have small stomachs and big nutrient needs, so every bite has to work harder than an adult's does. A dense snack fills a real gap on the days the vegetables don't get eaten. It's a snack though, not a meal replacement.</w:t>
+        <w:t xml:space="preserve">Nutrient density matters here because young children have small stomachs and high nutrient needs, so each bite has to do more work than an adult's would. It is meant as a snack, not a meal replacement.</w:t>
       </w:r>
     </w:p>
     <w:p>
@@ -377,20 +364,20 @@
           <w:sz w:val="22"/>
           <w:szCs w:val="22"/>
         </w:rPr>
-        <w:t xml:space="preserve">[How it is made, if you have the time]</w:t>
-      </w:r>
-    </w:p>
-    <w:p>
-      <w:pPr>
-        <w:spacing w:after="180" w:line="300"/>
-      </w:pPr>
-      <w:r>
-        <w:rPr>
-          <w:rFonts w:ascii="Calibri" w:cs="Calibri" w:eastAsia="Calibri" w:hAnsi="Calibri"/>
-          <w:sz w:val="24"/>
-          <w:szCs w:val="24"/>
-        </w:rPr>
-        <w:t xml:space="preserve">Making it is four steps and no baking. The dry ingredients and the seed butter get mixed into a firm dough, pressed into a brick shaped mould with the studs, chilled until it holds its shape, and packed. It keeps about five days in the fridge or two months in the freezer.</w:t>
+        <w:t xml:space="preserve">[How it is made]</w:t>
+      </w:r>
+    </w:p>
+    <w:p>
+      <w:pPr>
+        <w:spacing w:after="180" w:line="300"/>
+      </w:pPr>
+      <w:r>
+        <w:rPr>
+          <w:rFonts w:ascii="Calibri" w:cs="Calibri" w:eastAsia="Calibri" w:hAnsi="Calibri"/>
+          <w:sz w:val="24"/>
+          <w:szCs w:val="24"/>
+        </w:rPr>
+        <w:t xml:space="preserve">It is made in four steps with no baking. The dry ingredients and the seed butter are mixed into a firm dough, pressed into a brick shaped mould, chilled until it holds its shape, then packed. It keeps about five days in the fridge, or two months in the freezer.</w:t>
       </w:r>
     </w:p>
     <w:p>
@@ -424,20 +411,20 @@
           <w:sz w:val="24"/>
           <w:szCs w:val="24"/>
         </w:rPr>
-        <w:t xml:space="preserve">We're planning on $2 a brick, sold in packs of seven. That's $14 for a week, one brick a day. No subscription, and it doesn't take up freezer space.</w:t>
-      </w:r>
-    </w:p>
-    <w:p>
-      <w:pPr>
-        <w:spacing w:after="180" w:line="300"/>
-      </w:pPr>
-      <w:r>
-        <w:rPr>
-          <w:rFonts w:ascii="Calibri" w:cs="Calibri" w:eastAsia="Calibri" w:hAnsi="Calibri"/>
-          <w:sz w:val="24"/>
-          <w:szCs w:val="24"/>
-        </w:rPr>
-        <w:t xml:space="preserve">Each pack also comes with plans for a new build. A different design every time, so you're not just buying seven snacks, you're buying something to make. That's the part we think brings people back for the next pack.</w:t>
+        <w:t xml:space="preserve">We are planning on $2 per brick, sold in packs of seven. That is $14 for a week at one a day. There is no subscription, and it does not need freezer space.</w:t>
+      </w:r>
+    </w:p>
+    <w:p>
+      <w:pPr>
+        <w:spacing w:after="180" w:line="300"/>
+      </w:pPr>
+      <w:r>
+        <w:rPr>
+          <w:rFonts w:ascii="Calibri" w:cs="Calibri" w:eastAsia="Calibri" w:hAnsi="Calibri"/>
+          <w:sz w:val="24"/>
+          <w:szCs w:val="24"/>
+        </w:rPr>
+        <w:t xml:space="preserve">Each pack also includes plans for a new build, with a different design each time. That is the part we think would bring people back for another pack, rather than buying it once.</w:t>
       </w:r>
     </w:p>
     <w:p>
@@ -471,33 +458,20 @@
           <w:sz w:val="24"/>
           <w:szCs w:val="24"/>
         </w:rPr>
-        <w:t xml:space="preserve">NutriBrick is still a concept. We're a Year 10 team, we haven't made a sellable product yet, and this website is our pitch for it.</w:t>
-      </w:r>
-    </w:p>
-    <w:p>
-      <w:pPr>
-        <w:spacing w:after="180" w:line="300"/>
-      </w:pPr>
-      <w:r>
-        <w:rPr>
-          <w:rFonts w:ascii="Calibri" w:cs="Calibri" w:eastAsia="Calibri" w:hAnsi="Calibri"/>
-          <w:sz w:val="24"/>
-          <w:szCs w:val="24"/>
-        </w:rPr>
-        <w:t xml:space="preserve">But we think the idea holds up. Kids already decide what they'll eat based on how it looks and how it feels in their hands. Every other healthy snack asks them to ignore that. We built around it instead.</w:t>
-      </w:r>
-    </w:p>
-    <w:p>
-      <w:pPr>
-        <w:spacing w:after="180" w:line="300"/>
-      </w:pPr>
-      <w:r>
-        <w:rPr>
-          <w:rFonts w:ascii="Calibri" w:cs="Calibri" w:eastAsia="Calibri" w:hAnsi="Calibri"/>
-          <w:sz w:val="24"/>
-          <w:szCs w:val="24"/>
-        </w:rPr>
-        <w:t xml:space="preserve">Thanks for listening.</w:t>
+        <w:t xml:space="preserve">NutriBrick is a concept at this stage. We are a Year 10 team working through the Future Anything program, we have not produced a sellable product, and this website is our pitch for the idea.</w:t>
+      </w:r>
+    </w:p>
+    <w:p>
+      <w:pPr>
+        <w:spacing w:after="180" w:line="300"/>
+      </w:pPr>
+      <w:r>
+        <w:rPr>
+          <w:rFonts w:ascii="Calibri" w:cs="Calibri" w:eastAsia="Calibri" w:hAnsi="Calibri"/>
+          <w:sz w:val="24"/>
+          <w:szCs w:val="24"/>
+        </w:rPr>
+        <w:t xml:space="preserve">What we are confident about is the reasoning behind it. Children decide with their eyes and their hands first, and most healthy snacks ignore that. Ours is built around it.</w:t>
       </w:r>
     </w:p>
     <w:p>
@@ -530,7 +504,7 @@
           <w:sz w:val="22"/>
           <w:szCs w:val="22"/>
         </w:rPr>
-        <w:t xml:space="preserve">Slow down on the "don't play with your food" section. Say the rule first and let people agree with it, then explain why it doesn't apply. If you rush it, the point gets lost.</w:t>
+        <w:t xml:space="preserve">Slow down through the "don't play with your food" section. State the rule first, then explain why it does not apply. If it is rushed the point is lost.</w:t>
       </w:r>
     </w:p>
     <w:p>
@@ -548,7 +522,7 @@
           <w:sz w:val="22"/>
           <w:szCs w:val="22"/>
         </w:rPr>
-        <w:t xml:space="preserve">Pause after "you build a tower, and then you eat the tower". That line does a lot of work.</w:t>
+        <w:t xml:space="preserve">Let the 3D brick finish loading before talking about it.</w:t>
       </w:r>
     </w:p>
     <w:p>
@@ -566,7 +540,7 @@
           <w:sz w:val="22"/>
           <w:szCs w:val="22"/>
         </w:rPr>
-        <w:t xml:space="preserve">Let the 3D brick finish loading before you start talking about it.</w:t>
+        <w:t xml:space="preserve">Say "building brick" rather than "LEGO". LEGO and Duplo are trademarks, so it is safer not to lean on them in a pitch.</w:t>
       </w:r>
     </w:p>
     <w:p>
@@ -584,7 +558,7 @@
           <w:sz w:val="22"/>
           <w:szCs w:val="22"/>
         </w:rPr>
-        <w:t xml:space="preserve">Say "building brick" rather than "LEGO". LEGO is a trademark and it is safer not to use it in a pitch.</w:t>
+        <w:t xml:space="preserve">Check the 95% statistic before presenting and have the source ready. It is the number a judge is most likely to ask about.</w:t>
       </w:r>
     </w:p>
     <w:p>
@@ -602,7 +576,7 @@
           <w:sz w:val="22"/>
           <w:szCs w:val="22"/>
         </w:rPr>
-        <w:t xml:space="preserve">Check the 95% statistic before you present and have the source ready. It is the number a judge is most likely to ask about.</w:t>
+        <w:t xml:space="preserve">If running over time, cut the "how it is made" section. It is the least important part.</w:t>
       </w:r>
     </w:p>
     <w:p>
@@ -620,7 +594,7 @@
           <w:sz w:val="22"/>
           <w:szCs w:val="22"/>
         </w:rPr>
-        <w:t xml:space="preserve">If you are running over time, cut the "how it is made" section. It is the least important part.</w:t>
+        <w:t xml:space="preserve">If asked whether it is a real product, say straight away that it is a concept, the nutrition figures are recipe targets, and the website is the pitch.</w:t>
       </w:r>
     </w:p>
     <w:p>
@@ -638,25 +612,7 @@
           <w:sz w:val="22"/>
           <w:szCs w:val="22"/>
         </w:rPr>
-        <w:t xml:space="preserve">If someone asks whether it is a real product, say straight away that it is a concept, the nutrition numbers are targets, and the website is the pitch.</w:t>
-      </w:r>
-    </w:p>
-    <w:p>
-      <w:pPr>
-        <w:pStyle w:val="ListParagraph"/>
-        <w:numPr>
-          <w:ilvl w:val="0"/>
-          <w:numId w:val="2"/>
-        </w:numPr>
-        <w:spacing w:after="140" w:line="290"/>
-      </w:pPr>
-      <w:r>
-        <w:rPr>
-          <w:rFonts w:ascii="Calibri" w:cs="Calibri" w:eastAsia="Calibri" w:hAnsi="Calibri"/>
-          <w:sz w:val="22"/>
-          <w:szCs w:val="22"/>
-        </w:rPr>
-        <w:t xml:space="preserve">If someone asks about the build plans, they are a card in each pack with a design to make out of the seven bricks, and it is different every pack.</w:t>
+        <w:t xml:space="preserve">If asked about the build plans, they are a card in each pack with a design to make from the seven bricks, different in every pack.</w:t>
       </w:r>
     </w:p>
     <w:sectPr>

</xml_diff>

<commit_message>
Give the script drive without making it a performance
The plain rewrite went flat. This keeps it informational but stops it
reading like a list of facts: shorter sentences mixed with longer ones,
direct claims instead of hedged ones, and the concrete details doing the
work rather than phrasing.

Opens on what the product is, not on an introduction. No slogans, no
scene-setting, no em dashes.

Added a section on when it actually fits into a day, the lunchbox, after
school, and out of the house, plus the launch flavour. That is real pitch
content and it brings the length back into range after the tightening.

697 spoken words: 4:30 at 155 wpm, 4:48 at 145, 4:59 at 140.

Co-Authored-By: Claude Opus 5 <noreply@anthropic.com>
Claude-Session: https://claude.ai/code/session_01FsP9zUCC7wrRm8MWR8aTNS
</commit_message>
<xml_diff>
--- a/docs/NutriBrick-pitch-script.docx
+++ b/docs/NutriBrick-pitch-script.docx
@@ -27,7 +27,7 @@
           <w:sz w:val="20"/>
           <w:szCs w:val="20"/>
         </w:rPr>
-        <w:t xml:space="preserve">689 words. Around 4 minutes 30 to 5 minutes depending on pace. Lines in square brackets are stage directions, not words to say.</w:t>
+        <w:t xml:space="preserve">697 words. Around 4 minutes 30 to 5 minutes depending on pace. Lines in square brackets are stage directions, not words to say.</w:t>
       </w:r>
     </w:p>
     <w:p>
@@ -61,33 +61,33 @@
           <w:sz w:val="24"/>
           <w:szCs w:val="24"/>
         </w:rPr>
-        <w:t xml:space="preserve">Our product is called NutriBrick. It is a snack for primary school aged children, shaped like a building brick.</w:t>
-      </w:r>
-    </w:p>
-    <w:p>
-      <w:pPr>
-        <w:spacing w:after="180" w:line="300"/>
-      </w:pPr>
-      <w:r>
-        <w:rPr>
-          <w:rFonts w:ascii="Calibri" w:cs="Calibri" w:eastAsia="Calibri" w:hAnsi="Calibri"/>
-          <w:sz w:val="24"/>
-          <w:szCs w:val="24"/>
-        </w:rPr>
-        <w:t xml:space="preserve">The problem we set out to solve is that a lot of Australian children are not eating well. Our research found that over a million children in Australia are unhealthy, and that 95% are not meeting their daily macronutrient targets.</w:t>
-      </w:r>
-    </w:p>
-    <w:p>
-      <w:pPr>
-        <w:spacing w:after="180" w:line="300"/>
-      </w:pPr>
-      <w:r>
-        <w:rPr>
-          <w:rFonts w:ascii="Calibri" w:cs="Calibri" w:eastAsia="Calibri" w:hAnsi="Calibri"/>
-          <w:sz w:val="24"/>
-          <w:szCs w:val="24"/>
-        </w:rPr>
-        <w:t xml:space="preserve">The part that matters is why. It is not that parents do not know what is healthy, because most of them do. The problem is getting children to actually eat it. The healthy snack gets left, something sweet gets swapped in instead, and the same thing happens the next day.</w:t>
+        <w:t xml:space="preserve">NutriBrick is a snack for primary school kids, shaped like a building brick that actually stacks.</w:t>
+      </w:r>
+    </w:p>
+    <w:p>
+      <w:pPr>
+        <w:spacing w:after="180" w:line="300"/>
+      </w:pPr>
+      <w:r>
+        <w:rPr>
+          <w:rFonts w:ascii="Calibri" w:cs="Calibri" w:eastAsia="Calibri" w:hAnsi="Calibri"/>
+          <w:sz w:val="24"/>
+          <w:szCs w:val="24"/>
+        </w:rPr>
+        <w:t xml:space="preserve">We started from a problem. Over a million children in Australia are unhealthy, and 95% are not meeting their daily macronutrient targets.</w:t>
+      </w:r>
+    </w:p>
+    <w:p>
+      <w:pPr>
+        <w:spacing w:after="180" w:line="300"/>
+      </w:pPr>
+      <w:r>
+        <w:rPr>
+          <w:rFonts w:ascii="Calibri" w:cs="Calibri" w:eastAsia="Calibri" w:hAnsi="Calibri"/>
+          <w:sz w:val="24"/>
+          <w:szCs w:val="24"/>
+        </w:rPr>
+        <w:t xml:space="preserve">Parents already know what is healthy. That is not the gap. The hard part is getting a kid to eat it. The healthy snack gets left, something sweet gets swapped in, and the same thing happens the next day.</w:t>
       </w:r>
     </w:p>
     <w:p>
@@ -121,7 +121,7 @@
           <w:sz w:val="24"/>
           <w:szCs w:val="24"/>
         </w:rPr>
-        <w:t xml:space="preserve">Younger children mostly decide what they will eat based on how it looks and how it feels in their hands, rather than on what is in it. So a snack that is good for them but looks boring tends to lose, no matter how much a parent explains it.</w:t>
+        <w:t xml:space="preserve">Young kids decide what they eat by how it looks and how it feels in their hands, not by what is in it. That is why explaining does not work. A snack can be perfect nutritionally and still lose to a packet of chips, because the packet looks better.</w:t>
       </w:r>
     </w:p>
     <w:p>
@@ -155,7 +155,7 @@
           <w:sz w:val="24"/>
           <w:szCs w:val="24"/>
         </w:rPr>
-        <w:t xml:space="preserve">NutriBrick is designed around that. It is a food bite about the size of a Duplo brick, with studs on top that interlock properly, so the bricks stack together. Children build something out of them, and then eat it.</w:t>
+        <w:t xml:space="preserve">NutriBrick is built around that. It is a food bite the size of a Duplo brick, and the studs on top interlock properly, so the bricks stack together. Kids build something out of them, then eat it.</w:t>
       </w:r>
     </w:p>
     <w:p>
@@ -189,20 +189,20 @@
           <w:sz w:val="24"/>
           <w:szCs w:val="24"/>
         </w:rPr>
-        <w:t xml:space="preserve">One thing we had to think about is that a lot of parents do not want their kids playing with food. That rule exists for a reason. Playing with food normally means it gets mashed, hidden or dropped, and none of it actually gets eaten.</w:t>
-      </w:r>
-    </w:p>
-    <w:p>
-      <w:pPr>
-        <w:spacing w:after="180" w:line="300"/>
-      </w:pPr>
-      <w:r>
-        <w:rPr>
-          <w:rFonts w:ascii="Calibri" w:cs="Calibri" w:eastAsia="Calibri" w:hAnsi="Calibri"/>
-          <w:sz w:val="24"/>
-          <w:szCs w:val="24"/>
-        </w:rPr>
-        <w:t xml:space="preserve">With our product, the building is what leads to it being eaten. The food is not wasted, so the reason behind the rule does not really apply here.</w:t>
+        <w:t xml:space="preserve">We know plenty of parents do not want their kids playing with food, and that rule is there for a reason. Playing with food normally means it gets mashed, hidden, or dropped on the floor. None of it gets eaten.</w:t>
+      </w:r>
+    </w:p>
+    <w:p>
+      <w:pPr>
+        <w:spacing w:after="180" w:line="300"/>
+      </w:pPr>
+      <w:r>
+        <w:rPr>
+          <w:rFonts w:ascii="Calibri" w:cs="Calibri" w:eastAsia="Calibri" w:hAnsi="Calibri"/>
+          <w:sz w:val="24"/>
+          <w:szCs w:val="24"/>
+        </w:rPr>
+        <w:t xml:space="preserve">With ours, building it is what gets it eaten. The food is not wasted, it is used. So the reason behind the rule does not apply here.</w:t>
       </w:r>
     </w:p>
     <w:p>
@@ -236,7 +236,20 @@
           <w:sz w:val="24"/>
           <w:szCs w:val="24"/>
         </w:rPr>
-        <w:t xml:space="preserve">We compared it against what is already available. Frozen kids meals need a freezer, a microwave and about twelve minutes. Meal pouches are reasonable nutritionally, but there is nothing for a child to do with them. There are already lolly blocks shaped like bricks, but the shape is the whole product and the inside is sugar. We could not find an existing product that was both something to play with and genuinely nutritious.</w:t>
+        <w:t xml:space="preserve">We looked at what is already on the shelf. Frozen kids meals need a freezer, a microwave and twelve minutes. Meal pouches are fine nutritionally, but there is nothing for a kid to do with them. Lolly blocks already come in brick shapes, but the shape is all they are. Inside it is sugar.</w:t>
+      </w:r>
+    </w:p>
+    <w:p>
+      <w:pPr>
+        <w:spacing w:after="180" w:line="300"/>
+      </w:pPr>
+      <w:r>
+        <w:rPr>
+          <w:rFonts w:ascii="Calibri" w:cs="Calibri" w:eastAsia="Calibri" w:hAnsi="Calibri"/>
+          <w:sz w:val="24"/>
+          <w:szCs w:val="24"/>
+        </w:rPr>
+        <w:t xml:space="preserve">Nothing on that shelf is both a toy and real food.</w:t>
       </w:r>
     </w:p>
     <w:p>
@@ -270,46 +283,46 @@
           <w:sz w:val="24"/>
           <w:szCs w:val="24"/>
         </w:rPr>
-        <w:t xml:space="preserve">One brick is 45 grams. It contains 203 calories, 13 grams of protein, 4 grams of fibre, and a full day of vitamin C, A and D for a young child.</w:t>
-      </w:r>
-    </w:p>
-    <w:p>
-      <w:pPr>
-        <w:spacing w:after="180" w:line="300"/>
-      </w:pPr>
-      <w:r>
-        <w:rPr>
-          <w:rFonts w:ascii="Calibri" w:cs="Calibri" w:eastAsia="Calibri" w:hAnsi="Calibri"/>
-          <w:sz w:val="24"/>
-          <w:szCs w:val="24"/>
-        </w:rPr>
-        <w:t xml:space="preserve">There are seven ingredients. Rolled oats, sunflower seed butter, milk protein, dates, chia and flaxseed, and cocoa and cinnamon for flavour. The only added part is the three vitamins, because a bite this size cannot fit a full day of them from food alone.</w:t>
-      </w:r>
-    </w:p>
-    <w:p>
-      <w:pPr>
-        <w:spacing w:after="180" w:line="300"/>
-      </w:pPr>
-      <w:r>
-        <w:rPr>
-          <w:rFonts w:ascii="Calibri" w:cs="Calibri" w:eastAsia="Calibri" w:hAnsi="Calibri"/>
-          <w:sz w:val="24"/>
-          <w:szCs w:val="24"/>
-        </w:rPr>
-        <w:t xml:space="preserve">It is nut free, because the bind comes from sunflower seed butter rather than peanut butter, which means it can go to school. There is no gelatine, no refined sugar and no artificial colours.</w:t>
-      </w:r>
-    </w:p>
-    <w:p>
-      <w:pPr>
-        <w:spacing w:after="180" w:line="300"/>
-      </w:pPr>
-      <w:r>
-        <w:rPr>
-          <w:rFonts w:ascii="Calibri" w:cs="Calibri" w:eastAsia="Calibri" w:hAnsi="Calibri"/>
-          <w:sz w:val="24"/>
-          <w:szCs w:val="24"/>
-        </w:rPr>
-        <w:t xml:space="preserve">These figures are our targets for the recipe. It has not been lab tested, because it is still a concept.</w:t>
+        <w:t xml:space="preserve">One brick is 45 grams. That is 203 calories, 13 grams of protein, 4 grams of fibre, and a full day of vitamin C, A and D for a young child.</w:t>
+      </w:r>
+    </w:p>
+    <w:p>
+      <w:pPr>
+        <w:spacing w:after="180" w:line="300"/>
+      </w:pPr>
+      <w:r>
+        <w:rPr>
+          <w:rFonts w:ascii="Calibri" w:cs="Calibri" w:eastAsia="Calibri" w:hAnsi="Calibri"/>
+          <w:sz w:val="24"/>
+          <w:szCs w:val="24"/>
+        </w:rPr>
+        <w:t xml:space="preserve">Seven ingredients. Rolled oats, sunflower seed butter, milk protein, dates, chia and flaxseed, and cocoa and cinnamon for flavour. The only thing we add in is those three vitamins, because a bite this size cannot fit a full day of them from food alone.</w:t>
+      </w:r>
+    </w:p>
+    <w:p>
+      <w:pPr>
+        <w:spacing w:after="180" w:line="300"/>
+      </w:pPr>
+      <w:r>
+        <w:rPr>
+          <w:rFonts w:ascii="Calibri" w:cs="Calibri" w:eastAsia="Calibri" w:hAnsi="Calibri"/>
+          <w:sz w:val="24"/>
+          <w:szCs w:val="24"/>
+        </w:rPr>
+        <w:t xml:space="preserve">It is nut free. The bind is sunflower seed butter instead of peanut butter, so it clears the school gate. No gelatine, no refined sugar, no artificial colours.</w:t>
+      </w:r>
+    </w:p>
+    <w:p>
+      <w:pPr>
+        <w:spacing w:after="180" w:line="300"/>
+      </w:pPr>
+      <w:r>
+        <w:rPr>
+          <w:rFonts w:ascii="Calibri" w:cs="Calibri" w:eastAsia="Calibri" w:hAnsi="Calibri"/>
+          <w:sz w:val="24"/>
+          <w:szCs w:val="24"/>
+        </w:rPr>
+        <w:t xml:space="preserve">Those figures are our targets for the recipe. It has not been lab tested, because it is still a concept.</w:t>
       </w:r>
     </w:p>
     <w:p>
@@ -343,7 +356,7 @@
           <w:sz w:val="24"/>
           <w:szCs w:val="24"/>
         </w:rPr>
-        <w:t xml:space="preserve">Nutrient density matters here because young children have small stomachs and high nutrient needs, so each bite has to do more work than an adult's would. It is meant as a snack, not a meal replacement.</w:t>
+        <w:t xml:space="preserve">Density matters because young kids have small stomachs and high nutrient needs, so every bite has to work harder than an adult's does. It is a snack though, not a meal replacement.</w:t>
       </w:r>
     </w:p>
     <w:p>
@@ -377,7 +390,7 @@
           <w:sz w:val="24"/>
           <w:szCs w:val="24"/>
         </w:rPr>
-        <w:t xml:space="preserve">It is made in four steps with no baking. The dry ingredients and the seed butter are mixed into a firm dough, pressed into a brick shaped mould, chilled until it holds its shape, then packed. It keeps about five days in the fridge, or two months in the freezer.</w:t>
+        <w:t xml:space="preserve">Four steps, no baking. The dry ingredients and the seed butter get mixed into a firm dough, pressed into a brick shaped mould, chilled until it holds its shape, then packed. It keeps five days in the fridge, or two months in the freezer.</w:t>
       </w:r>
     </w:p>
     <w:p>
@@ -398,6 +411,53 @@
           <w:sz w:val="22"/>
           <w:szCs w:val="22"/>
         </w:rPr>
+        <w:t xml:space="preserve">[When it fits into the day]</w:t>
+      </w:r>
+    </w:p>
+    <w:p>
+      <w:pPr>
+        <w:spacing w:after="180" w:line="300"/>
+      </w:pPr>
+      <w:r>
+        <w:rPr>
+          <w:rFonts w:ascii="Calibri" w:cs="Calibri" w:eastAsia="Calibri" w:hAnsi="Calibri"/>
+          <w:sz w:val="24"/>
+          <w:szCs w:val="24"/>
+        </w:rPr>
+        <w:t xml:space="preserve">We designed it around three moments. In the lunchbox, because it is nut free and holds its shape until recess. After school, when a kid is starving at four but dinner is at six, and one brick covers that gap without wrecking their appetite. And out of the house, on car trips or in waiting rooms, where it is a snack and something to do in the same pocket.</w:t>
+      </w:r>
+    </w:p>
+    <w:p>
+      <w:pPr>
+        <w:spacing w:after="180" w:line="300"/>
+      </w:pPr>
+      <w:r>
+        <w:rPr>
+          <w:rFonts w:ascii="Calibri" w:cs="Calibri" w:eastAsia="Calibri" w:hAnsi="Calibri"/>
+          <w:sz w:val="24"/>
+          <w:szCs w:val="24"/>
+        </w:rPr>
+        <w:t xml:space="preserve">At launch there would be one flavour, chocolate and cinnamon, done properly before we add any others.</w:t>
+      </w:r>
+    </w:p>
+    <w:p>
+      <w:pPr>
+        <w:spacing w:after="120" w:before="240" w:line="300"/>
+        <w:rPr>
+          <w:b/>
+          <w:bCs/>
+          <w:sz w:val="22"/>
+          <w:szCs w:val="22"/>
+        </w:rPr>
+      </w:pPr>
+      <w:r>
+        <w:rPr>
+          <w:rFonts w:ascii="Calibri" w:cs="Calibri" w:eastAsia="Calibri" w:hAnsi="Calibri"/>
+          <w:b/>
+          <w:bCs/>
+          <w:sz w:val="22"/>
+          <w:szCs w:val="22"/>
+        </w:rPr>
         <w:t xml:space="preserve">[Pricing]</w:t>
       </w:r>
     </w:p>
@@ -411,20 +471,20 @@
           <w:sz w:val="24"/>
           <w:szCs w:val="24"/>
         </w:rPr>
-        <w:t xml:space="preserve">We are planning on $2 per brick, sold in packs of seven. That is $14 for a week at one a day. There is no subscription, and it does not need freezer space.</w:t>
-      </w:r>
-    </w:p>
-    <w:p>
-      <w:pPr>
-        <w:spacing w:after="180" w:line="300"/>
-      </w:pPr>
-      <w:r>
-        <w:rPr>
-          <w:rFonts w:ascii="Calibri" w:cs="Calibri" w:eastAsia="Calibri" w:hAnsi="Calibri"/>
-          <w:sz w:val="24"/>
-          <w:szCs w:val="24"/>
-        </w:rPr>
-        <w:t xml:space="preserve">Each pack also includes plans for a new build, with a different design each time. That is the part we think would bring people back for another pack, rather than buying it once.</w:t>
+        <w:t xml:space="preserve">$2 a brick, sold in packs of seven. That is $14 for a week at one a day. No subscription, and no freezer space.</w:t>
+      </w:r>
+    </w:p>
+    <w:p>
+      <w:pPr>
+        <w:spacing w:after="180" w:line="300"/>
+      </w:pPr>
+      <w:r>
+        <w:rPr>
+          <w:rFonts w:ascii="Calibri" w:cs="Calibri" w:eastAsia="Calibri" w:hAnsi="Calibri"/>
+          <w:sz w:val="24"/>
+          <w:szCs w:val="24"/>
+        </w:rPr>
+        <w:t xml:space="preserve">Every pack also comes with plans for a new build, a different design each time. That is what would bring someone back for a second pack instead of buying it once.</w:t>
       </w:r>
     </w:p>
     <w:p>
@@ -458,20 +518,20 @@
           <w:sz w:val="24"/>
           <w:szCs w:val="24"/>
         </w:rPr>
-        <w:t xml:space="preserve">NutriBrick is a concept at this stage. We are a Year 10 team working through the Future Anything program, we have not produced a sellable product, and this website is our pitch for the idea.</w:t>
-      </w:r>
-    </w:p>
-    <w:p>
-      <w:pPr>
-        <w:spacing w:after="180" w:line="300"/>
-      </w:pPr>
-      <w:r>
-        <w:rPr>
-          <w:rFonts w:ascii="Calibri" w:cs="Calibri" w:eastAsia="Calibri" w:hAnsi="Calibri"/>
-          <w:sz w:val="24"/>
-          <w:szCs w:val="24"/>
-        </w:rPr>
-        <w:t xml:space="preserve">What we are confident about is the reasoning behind it. Children decide with their eyes and their hands first, and most healthy snacks ignore that. Ours is built around it.</w:t>
+        <w:t xml:space="preserve">NutriBrick is a concept. We are a Year 10 team working through Future Anything, there is no sellable product yet, and the website is our pitch for the idea.</w:t>
+      </w:r>
+    </w:p>
+    <w:p>
+      <w:pPr>
+        <w:spacing w:after="180" w:line="300"/>
+      </w:pPr>
+      <w:r>
+        <w:rPr>
+          <w:rFonts w:ascii="Calibri" w:cs="Calibri" w:eastAsia="Calibri" w:hAnsi="Calibri"/>
+          <w:sz w:val="24"/>
+          <w:szCs w:val="24"/>
+        </w:rPr>
+        <w:t xml:space="preserve">What we are sure about is the reasoning behind it. Kids decide with their eyes and their hands before anything else, and almost every healthy snack ignores that. Ours is built on it.</w:t>
       </w:r>
     </w:p>
     <w:p>
@@ -523,6 +583,24 @@
           <w:szCs w:val="22"/>
         </w:rPr>
         <w:t xml:space="preserve">Let the 3D brick finish loading before talking about it.</w:t>
+      </w:r>
+    </w:p>
+    <w:p>
+      <w:pPr>
+        <w:pStyle w:val="ListParagraph"/>
+        <w:numPr>
+          <w:ilvl w:val="0"/>
+          <w:numId w:val="2"/>
+        </w:numPr>
+        <w:spacing w:after="140" w:line="290"/>
+      </w:pPr>
+      <w:r>
+        <w:rPr>
+          <w:rFonts w:ascii="Calibri" w:cs="Calibri" w:eastAsia="Calibri" w:hAnsi="Calibri"/>
+          <w:sz w:val="22"/>
+          <w:szCs w:val="22"/>
+        </w:rPr>
+        <w:t xml:space="preserve">The nutrition numbers are the strongest part. Say them clearly and do not rush the list.</w:t>
       </w:r>
     </w:p>
     <w:p>

</xml_diff>